<commit_message>
Add groups support schema
</commit_message>
<xml_diff>
--- a/docs/planning/post-conference/_current/tasks/Docs/Chapter_2_Build_Steps.docx
+++ b/docs/planning/post-conference/_current/tasks/Docs/Chapter_2_Build_Steps.docx
@@ -23,10 +23,10 @@
         <w:tblLook w:val="04A0" w:firstRow="1" w:lastRow="0" w:firstColumn="1" w:lastColumn="0" w:noHBand="0" w:noVBand="1"/>
       </w:tblPr>
       <w:tblGrid>
-        <w:gridCol w:w="737"/>
-        <w:gridCol w:w="1482"/>
-        <w:gridCol w:w="3904"/>
-        <w:gridCol w:w="3327"/>
+        <w:gridCol w:w="600"/>
+        <w:gridCol w:w="1115"/>
+        <w:gridCol w:w="2736"/>
+        <w:gridCol w:w="4999"/>
       </w:tblGrid>
       <w:tr>
         <w:trPr>
@@ -699,18 +699,23 @@
           </w:tcPr>
           <w:p>
             <w:r>
-              <w:t>Seed demo membership</w:t>
-            </w:r>
-          </w:p>
-        </w:tc>
-        <w:tc>
-          <w:tcPr>
-            <w:tcW w:w="0" w:type="auto"/>
-            <w:vAlign w:val="center"/>
-            <w:hideMark/>
-          </w:tcPr>
-          <w:p>
-            <w:r>
+              <w:t>Seed demo membersh</w:t>
+            </w:r>
+            <w:r>
+              <w:lastRenderedPageBreak/>
+              <w:t>ip</w:t>
+            </w:r>
+          </w:p>
+        </w:tc>
+        <w:tc>
+          <w:tcPr>
+            <w:tcW w:w="0" w:type="auto"/>
+            <w:vAlign w:val="center"/>
+            <w:hideMark/>
+          </w:tcPr>
+          <w:p>
+            <w:r>
+              <w:lastRenderedPageBreak/>
               <w:t>First account/system membership</w:t>
             </w:r>
           </w:p>
@@ -723,11 +728,7 @@
           </w:tcPr>
           <w:p>
             <w:r>
-              <w:t xml:space="preserve">Demo account has Owner membership on the existing </w:t>
-            </w:r>
-            <w:r>
-              <w:lastRenderedPageBreak/>
-              <w:t>demo system</w:t>
+              <w:t>Demo account has Owner membership on the existing demo system</w:t>
             </w:r>
           </w:p>
         </w:tc>
@@ -926,55 +927,104 @@
           <w:tcPr>
             <w:tcW w:w="0" w:type="auto"/>
             <w:vAlign w:val="center"/>
-            <w:hideMark/>
-          </w:tcPr>
-          <w:p>
-            <w:r>
-              <w:t>13</w:t>
-            </w:r>
-          </w:p>
-        </w:tc>
-        <w:tc>
-          <w:tcPr>
-            <w:tcW w:w="0" w:type="auto"/>
-            <w:vAlign w:val="center"/>
-            <w:hideMark/>
-          </w:tcPr>
-          <w:p>
-            <w:r>
-              <w:t>Add current-system resolver</w:t>
-            </w:r>
-          </w:p>
-        </w:tc>
-        <w:tc>
-          <w:tcPr>
-            <w:tcW w:w="0" w:type="auto"/>
-            <w:vAlign w:val="center"/>
-            <w:hideMark/>
-          </w:tcPr>
-          <w:p>
-            <w:r>
-              <w:t>Active account to active system</w:t>
-            </w:r>
-          </w:p>
-        </w:tc>
-        <w:tc>
-          <w:tcPr>
-            <w:tcW w:w="0" w:type="auto"/>
-            <w:vAlign w:val="center"/>
-            <w:hideMark/>
-          </w:tcPr>
-          <w:p>
-            <w:r>
-              <w:t xml:space="preserve">Demo path resolves </w:t>
-            </w:r>
-            <w:proofErr w:type="spellStart"/>
-            <w:r>
-              <w:t>SystemId</w:t>
-            </w:r>
-            <w:proofErr w:type="spellEnd"/>
-            <w:r>
-              <w:t xml:space="preserve"> through membership, rather than assuming the demo system directly</w:t>
+          </w:tcPr>
+          <w:p>
+            <w:r>
+              <w:t>12B</w:t>
+            </w:r>
+          </w:p>
+        </w:tc>
+        <w:tc>
+          <w:tcPr>
+            <w:tcW w:w="0" w:type="auto"/>
+            <w:vAlign w:val="center"/>
+          </w:tcPr>
+          <w:p>
+            <w:r>
+              <w:t>Extract access context helper</w:t>
+            </w:r>
+          </w:p>
+        </w:tc>
+        <w:tc>
+          <w:tcPr>
+            <w:tcW w:w="0" w:type="auto"/>
+            <w:vAlign w:val="center"/>
+          </w:tcPr>
+          <w:p>
+            <w:r>
+              <w:t xml:space="preserve">Reusable </w:t>
+            </w:r>
+            <w:proofErr w:type="spellStart"/>
+            <w:r>
+              <w:t>AccessContextHelper</w:t>
+            </w:r>
+            <w:proofErr w:type="spellEnd"/>
+            <w:r>
+              <w:t xml:space="preserve"> for account, membership, role, status, and access-context resolution. </w:t>
+            </w:r>
+            <w:proofErr w:type="spellStart"/>
+            <w:r>
+              <w:t>MeController</w:t>
+            </w:r>
+            <w:proofErr w:type="spellEnd"/>
+            <w:r>
+              <w:t xml:space="preserve"> keeps endpoint behavior but no longer owns shared access plumbing.</w:t>
+            </w:r>
+          </w:p>
+        </w:tc>
+        <w:tc>
+          <w:tcPr>
+            <w:tcW w:w="0" w:type="auto"/>
+            <w:vAlign w:val="center"/>
+          </w:tcPr>
+          <w:p>
+            <w:proofErr w:type="spellStart"/>
+            <w:r>
+              <w:t>AccessContextHelper.cs</w:t>
+            </w:r>
+            <w:proofErr w:type="spellEnd"/>
+            <w:r>
+              <w:t xml:space="preserve"> contains the moved records and resolver methods. </w:t>
+            </w:r>
+            <w:proofErr w:type="spellStart"/>
+            <w:r>
+              <w:t>MeController</w:t>
+            </w:r>
+            <w:proofErr w:type="spellEnd"/>
+            <w:r>
+              <w:t xml:space="preserve"> calls </w:t>
+            </w:r>
+            <w:proofErr w:type="spellStart"/>
+            <w:r>
+              <w:t>AccessContextHelper.ResolveCurrentAccessAsync</w:t>
+            </w:r>
+            <w:proofErr w:type="spellEnd"/>
+            <w:r>
+              <w:t>(connection). The API builds. /</w:t>
+            </w:r>
+            <w:proofErr w:type="spellStart"/>
+            <w:r>
+              <w:t>api</w:t>
+            </w:r>
+            <w:proofErr w:type="spellEnd"/>
+            <w:r>
+              <w:t xml:space="preserve">/me still returns </w:t>
+            </w:r>
+            <w:proofErr w:type="spellStart"/>
+            <w:r>
+              <w:t>currentAccount</w:t>
+            </w:r>
+            <w:proofErr w:type="spellEnd"/>
+            <w:r>
+              <w:t xml:space="preserve">, </w:t>
+            </w:r>
+            <w:proofErr w:type="spellStart"/>
+            <w:r>
+              <w:t>membershipAccess</w:t>
+            </w:r>
+            <w:proofErr w:type="spellEnd"/>
+            <w:r>
+              <w:t>, Active, Owner, PluralBridgeChap2SafeSpine, and existing counts. The branch contains a commit named Extract access context helper.</w:t>
             </w:r>
           </w:p>
         </w:tc>
@@ -991,43 +1041,51 @@
           </w:tcPr>
           <w:p>
             <w:r>
-              <w:t>14</w:t>
-            </w:r>
-          </w:p>
-        </w:tc>
-        <w:tc>
-          <w:tcPr>
-            <w:tcW w:w="0" w:type="auto"/>
-            <w:vAlign w:val="center"/>
-            <w:hideMark/>
-          </w:tcPr>
-          <w:p>
-            <w:r>
-              <w:t>Add authorization boundary</w:t>
-            </w:r>
-          </w:p>
-        </w:tc>
-        <w:tc>
-          <w:tcPr>
-            <w:tcW w:w="0" w:type="auto"/>
-            <w:vAlign w:val="center"/>
-            <w:hideMark/>
-          </w:tcPr>
-          <w:p>
-            <w:r>
-              <w:t>Membership check before system reads/writes</w:t>
-            </w:r>
-          </w:p>
-        </w:tc>
-        <w:tc>
-          <w:tcPr>
-            <w:tcW w:w="0" w:type="auto"/>
-            <w:vAlign w:val="center"/>
-            <w:hideMark/>
-          </w:tcPr>
-          <w:p>
-            <w:r>
-              <w:t>API checks active membership before returning system data</w:t>
+              <w:t>13</w:t>
+            </w:r>
+          </w:p>
+        </w:tc>
+        <w:tc>
+          <w:tcPr>
+            <w:tcW w:w="0" w:type="auto"/>
+            <w:vAlign w:val="center"/>
+            <w:hideMark/>
+          </w:tcPr>
+          <w:p>
+            <w:r>
+              <w:t>Add current-system resolver</w:t>
+            </w:r>
+          </w:p>
+        </w:tc>
+        <w:tc>
+          <w:tcPr>
+            <w:tcW w:w="0" w:type="auto"/>
+            <w:vAlign w:val="center"/>
+            <w:hideMark/>
+          </w:tcPr>
+          <w:p>
+            <w:r>
+              <w:t>Active account to active system</w:t>
+            </w:r>
+          </w:p>
+        </w:tc>
+        <w:tc>
+          <w:tcPr>
+            <w:tcW w:w="0" w:type="auto"/>
+            <w:vAlign w:val="center"/>
+            <w:hideMark/>
+          </w:tcPr>
+          <w:p>
+            <w:r>
+              <w:t xml:space="preserve">Demo path resolves </w:t>
+            </w:r>
+            <w:proofErr w:type="spellStart"/>
+            <w:r>
+              <w:t>SystemId</w:t>
+            </w:r>
+            <w:proofErr w:type="spellEnd"/>
+            <w:r>
+              <w:t xml:space="preserve"> through membership, rather than assuming the demo system directly</w:t>
             </w:r>
           </w:p>
         </w:tc>
@@ -1044,56 +1102,43 @@
           </w:tcPr>
           <w:p>
             <w:r>
-              <w:t>15</w:t>
-            </w:r>
-          </w:p>
-        </w:tc>
-        <w:tc>
-          <w:tcPr>
-            <w:tcW w:w="0" w:type="auto"/>
-            <w:vAlign w:val="center"/>
-            <w:hideMark/>
-          </w:tcPr>
-          <w:p>
-            <w:r>
-              <w:t xml:space="preserve">Preserve existing </w:t>
-            </w:r>
-            <w:proofErr w:type="spellStart"/>
-            <w:r>
-              <w:t>SystemId</w:t>
-            </w:r>
-            <w:proofErr w:type="spellEnd"/>
-            <w:r>
-              <w:t xml:space="preserve"> queries</w:t>
-            </w:r>
-          </w:p>
-        </w:tc>
-        <w:tc>
-          <w:tcPr>
-            <w:tcW w:w="0" w:type="auto"/>
-            <w:vAlign w:val="center"/>
-            <w:hideMark/>
-          </w:tcPr>
-          <w:p>
-            <w:r>
-              <w:t xml:space="preserve">Existing data access still partitions by </w:t>
-            </w:r>
-            <w:proofErr w:type="spellStart"/>
-            <w:r>
-              <w:t>SystemId</w:t>
-            </w:r>
-            <w:proofErr w:type="spellEnd"/>
-          </w:p>
-        </w:tc>
-        <w:tc>
-          <w:tcPr>
-            <w:tcW w:w="0" w:type="auto"/>
-            <w:vAlign w:val="center"/>
-            <w:hideMark/>
-          </w:tcPr>
-          <w:p>
-            <w:r>
-              <w:t>Members, front history, privacy buckets, and custom fields still load under the same system</w:t>
+              <w:t>14</w:t>
+            </w:r>
+          </w:p>
+        </w:tc>
+        <w:tc>
+          <w:tcPr>
+            <w:tcW w:w="0" w:type="auto"/>
+            <w:vAlign w:val="center"/>
+            <w:hideMark/>
+          </w:tcPr>
+          <w:p>
+            <w:r>
+              <w:t>Add authorization boundary</w:t>
+            </w:r>
+          </w:p>
+        </w:tc>
+        <w:tc>
+          <w:tcPr>
+            <w:tcW w:w="0" w:type="auto"/>
+            <w:vAlign w:val="center"/>
+            <w:hideMark/>
+          </w:tcPr>
+          <w:p>
+            <w:r>
+              <w:t>Membership check before system reads/writes</w:t>
+            </w:r>
+          </w:p>
+        </w:tc>
+        <w:tc>
+          <w:tcPr>
+            <w:tcW w:w="0" w:type="auto"/>
+            <w:vAlign w:val="center"/>
+            <w:hideMark/>
+          </w:tcPr>
+          <w:p>
+            <w:r>
+              <w:t>API checks active membership before returning system data</w:t>
             </w:r>
           </w:p>
         </w:tc>
@@ -1110,43 +1155,61 @@
           </w:tcPr>
           <w:p>
             <w:r>
-              <w:t>16</w:t>
-            </w:r>
-          </w:p>
-        </w:tc>
-        <w:tc>
-          <w:tcPr>
-            <w:tcW w:w="0" w:type="auto"/>
-            <w:vAlign w:val="center"/>
-            <w:hideMark/>
-          </w:tcPr>
-          <w:p>
-            <w:r>
-              <w:t>Add unauthorized tests</w:t>
-            </w:r>
-          </w:p>
-        </w:tc>
-        <w:tc>
-          <w:tcPr>
-            <w:tcW w:w="0" w:type="auto"/>
-            <w:vAlign w:val="center"/>
-            <w:hideMark/>
-          </w:tcPr>
-          <w:p>
-            <w:r>
-              <w:t>No membership means no system data</w:t>
-            </w:r>
-          </w:p>
-        </w:tc>
-        <w:tc>
-          <w:tcPr>
-            <w:tcW w:w="0" w:type="auto"/>
-            <w:vAlign w:val="center"/>
-            <w:hideMark/>
-          </w:tcPr>
-          <w:p>
-            <w:r>
-              <w:t>Missing/wrong membership fails cleanly</w:t>
+              <w:t>15</w:t>
+            </w:r>
+          </w:p>
+        </w:tc>
+        <w:tc>
+          <w:tcPr>
+            <w:tcW w:w="0" w:type="auto"/>
+            <w:vAlign w:val="center"/>
+            <w:hideMark/>
+          </w:tcPr>
+          <w:p>
+            <w:r>
+              <w:t xml:space="preserve">Preserve existing </w:t>
+            </w:r>
+            <w:proofErr w:type="spellStart"/>
+            <w:r>
+              <w:t>SystemId</w:t>
+            </w:r>
+            <w:proofErr w:type="spellEnd"/>
+            <w:r>
+              <w:t xml:space="preserve"> </w:t>
+            </w:r>
+            <w:r>
+              <w:lastRenderedPageBreak/>
+              <w:t>queries</w:t>
+            </w:r>
+          </w:p>
+        </w:tc>
+        <w:tc>
+          <w:tcPr>
+            <w:tcW w:w="0" w:type="auto"/>
+            <w:vAlign w:val="center"/>
+            <w:hideMark/>
+          </w:tcPr>
+          <w:p>
+            <w:r>
+              <w:lastRenderedPageBreak/>
+              <w:t xml:space="preserve">Existing data access still partitions by </w:t>
+            </w:r>
+            <w:proofErr w:type="spellStart"/>
+            <w:r>
+              <w:t>SystemId</w:t>
+            </w:r>
+            <w:proofErr w:type="spellEnd"/>
+          </w:p>
+        </w:tc>
+        <w:tc>
+          <w:tcPr>
+            <w:tcW w:w="0" w:type="auto"/>
+            <w:vAlign w:val="center"/>
+            <w:hideMark/>
+          </w:tcPr>
+          <w:p>
+            <w:r>
+              <w:t>Members, front history, privacy buckets, and custom fields still load under the same system</w:t>
             </w:r>
           </w:p>
         </w:tc>
@@ -1163,43 +1226,43 @@
           </w:tcPr>
           <w:p>
             <w:r>
-              <w:t>17</w:t>
-            </w:r>
-          </w:p>
-        </w:tc>
-        <w:tc>
-          <w:tcPr>
-            <w:tcW w:w="0" w:type="auto"/>
-            <w:vAlign w:val="center"/>
-            <w:hideMark/>
-          </w:tcPr>
-          <w:p>
-            <w:r>
-              <w:t>Add owner-access tests</w:t>
-            </w:r>
-          </w:p>
-        </w:tc>
-        <w:tc>
-          <w:tcPr>
-            <w:tcW w:w="0" w:type="auto"/>
-            <w:vAlign w:val="center"/>
-            <w:hideMark/>
-          </w:tcPr>
-          <w:p>
-            <w:r>
-              <w:t>Owner membership can access current system</w:t>
-            </w:r>
-          </w:p>
-        </w:tc>
-        <w:tc>
-          <w:tcPr>
-            <w:tcW w:w="0" w:type="auto"/>
-            <w:vAlign w:val="center"/>
-            <w:hideMark/>
-          </w:tcPr>
-          <w:p>
-            <w:r>
-              <w:t>Seeded demo owner sees the same data as before</w:t>
+              <w:t>16</w:t>
+            </w:r>
+          </w:p>
+        </w:tc>
+        <w:tc>
+          <w:tcPr>
+            <w:tcW w:w="0" w:type="auto"/>
+            <w:vAlign w:val="center"/>
+            <w:hideMark/>
+          </w:tcPr>
+          <w:p>
+            <w:r>
+              <w:t>Add unauthorized tests</w:t>
+            </w:r>
+          </w:p>
+        </w:tc>
+        <w:tc>
+          <w:tcPr>
+            <w:tcW w:w="0" w:type="auto"/>
+            <w:vAlign w:val="center"/>
+            <w:hideMark/>
+          </w:tcPr>
+          <w:p>
+            <w:r>
+              <w:t>No membership means no system data</w:t>
+            </w:r>
+          </w:p>
+        </w:tc>
+        <w:tc>
+          <w:tcPr>
+            <w:tcW w:w="0" w:type="auto"/>
+            <w:vAlign w:val="center"/>
+            <w:hideMark/>
+          </w:tcPr>
+          <w:p>
+            <w:r>
+              <w:t>Missing/wrong membership fails cleanly</w:t>
             </w:r>
           </w:p>
         </w:tc>
@@ -1216,52 +1279,43 @@
           </w:tcPr>
           <w:p>
             <w:r>
-              <w:t>18</w:t>
-            </w:r>
-          </w:p>
-        </w:tc>
-        <w:tc>
-          <w:tcPr>
-            <w:tcW w:w="0" w:type="auto"/>
-            <w:vAlign w:val="center"/>
-            <w:hideMark/>
-          </w:tcPr>
-          <w:p>
-            <w:r>
-              <w:t>Define PB Visibility Scope schema</w:t>
-            </w:r>
-          </w:p>
-        </w:tc>
-        <w:tc>
-          <w:tcPr>
-            <w:tcW w:w="0" w:type="auto"/>
-            <w:vAlign w:val="center"/>
-            <w:hideMark/>
-          </w:tcPr>
-          <w:p>
-            <w:r>
-              <w:t>PB-native privacy model</w:t>
-            </w:r>
-          </w:p>
-        </w:tc>
-        <w:tc>
-          <w:tcPr>
-            <w:tcW w:w="0" w:type="auto"/>
-            <w:vAlign w:val="center"/>
-            <w:hideMark/>
-          </w:tcPr>
-          <w:p>
-            <w:proofErr w:type="spellStart"/>
-            <w:r>
-              <w:t>pb_visibility_scopes</w:t>
-            </w:r>
-            <w:proofErr w:type="spellEnd"/>
-            <w:r>
-              <w:t xml:space="preserve"> or equivalent is named and designed as PB runtime visibility </w:t>
-            </w:r>
-            <w:r>
-              <w:lastRenderedPageBreak/>
-              <w:t>authority</w:t>
+              <w:t>17</w:t>
+            </w:r>
+          </w:p>
+        </w:tc>
+        <w:tc>
+          <w:tcPr>
+            <w:tcW w:w="0" w:type="auto"/>
+            <w:vAlign w:val="center"/>
+            <w:hideMark/>
+          </w:tcPr>
+          <w:p>
+            <w:r>
+              <w:t>Add owner-access tests</w:t>
+            </w:r>
+          </w:p>
+        </w:tc>
+        <w:tc>
+          <w:tcPr>
+            <w:tcW w:w="0" w:type="auto"/>
+            <w:vAlign w:val="center"/>
+            <w:hideMark/>
+          </w:tcPr>
+          <w:p>
+            <w:r>
+              <w:t>Owner membership can access current system</w:t>
+            </w:r>
+          </w:p>
+        </w:tc>
+        <w:tc>
+          <w:tcPr>
+            <w:tcW w:w="0" w:type="auto"/>
+            <w:vAlign w:val="center"/>
+            <w:hideMark/>
+          </w:tcPr>
+          <w:p>
+            <w:r>
+              <w:t>Seeded demo owner sees the same data as before</w:t>
             </w:r>
           </w:p>
         </w:tc>
@@ -1278,49 +1332,48 @@
           </w:tcPr>
           <w:p>
             <w:r>
-              <w:lastRenderedPageBreak/>
-              <w:t>19</w:t>
-            </w:r>
-          </w:p>
-        </w:tc>
-        <w:tc>
-          <w:tcPr>
-            <w:tcW w:w="0" w:type="auto"/>
-            <w:vAlign w:val="center"/>
-            <w:hideMark/>
-          </w:tcPr>
-          <w:p>
-            <w:r>
-              <w:t>Preserve SP privacy buckets</w:t>
-            </w:r>
-          </w:p>
-        </w:tc>
-        <w:tc>
-          <w:tcPr>
-            <w:tcW w:w="0" w:type="auto"/>
-            <w:vAlign w:val="center"/>
-            <w:hideMark/>
-          </w:tcPr>
-          <w:p>
-            <w:r>
-              <w:t>Imported source-shaped privacy data</w:t>
-            </w:r>
-          </w:p>
-        </w:tc>
-        <w:tc>
-          <w:tcPr>
-            <w:tcW w:w="0" w:type="auto"/>
-            <w:vAlign w:val="center"/>
-            <w:hideMark/>
-          </w:tcPr>
-          <w:p>
-            <w:proofErr w:type="spellStart"/>
-            <w:r>
-              <w:t>pb_privacy_buckets</w:t>
-            </w:r>
-            <w:proofErr w:type="spellEnd"/>
-            <w:r>
-              <w:t xml:space="preserve"> remains untouched as SP import/export fidelity data</w:t>
+              <w:t>18</w:t>
+            </w:r>
+          </w:p>
+        </w:tc>
+        <w:tc>
+          <w:tcPr>
+            <w:tcW w:w="0" w:type="auto"/>
+            <w:vAlign w:val="center"/>
+            <w:hideMark/>
+          </w:tcPr>
+          <w:p>
+            <w:r>
+              <w:t>Define PB Visibility Scope schema</w:t>
+            </w:r>
+          </w:p>
+        </w:tc>
+        <w:tc>
+          <w:tcPr>
+            <w:tcW w:w="0" w:type="auto"/>
+            <w:vAlign w:val="center"/>
+            <w:hideMark/>
+          </w:tcPr>
+          <w:p>
+            <w:r>
+              <w:t>PB-native privacy model</w:t>
+            </w:r>
+          </w:p>
+        </w:tc>
+        <w:tc>
+          <w:tcPr>
+            <w:tcW w:w="0" w:type="auto"/>
+            <w:vAlign w:val="center"/>
+            <w:hideMark/>
+          </w:tcPr>
+          <w:p>
+            <w:proofErr w:type="spellStart"/>
+            <w:r>
+              <w:t>pb_visibility_scopes</w:t>
+            </w:r>
+            <w:proofErr w:type="spellEnd"/>
+            <w:r>
+              <w:t xml:space="preserve"> or equivalent is named and designed as PB runtime visibility authority</w:t>
             </w:r>
           </w:p>
         </w:tc>
@@ -1337,43 +1390,48 @@
           </w:tcPr>
           <w:p>
             <w:r>
-              <w:t>20</w:t>
-            </w:r>
-          </w:p>
-        </w:tc>
-        <w:tc>
-          <w:tcPr>
-            <w:tcW w:w="0" w:type="auto"/>
-            <w:vAlign w:val="center"/>
-            <w:hideMark/>
-          </w:tcPr>
-          <w:p>
-            <w:r>
-              <w:t>Add visibility resolution rule</w:t>
-            </w:r>
-          </w:p>
-        </w:tc>
-        <w:tc>
-          <w:tcPr>
-            <w:tcW w:w="0" w:type="auto"/>
-            <w:vAlign w:val="center"/>
-            <w:hideMark/>
-          </w:tcPr>
-          <w:p>
-            <w:r>
-              <w:t>PB first, SP fallback</w:t>
-            </w:r>
-          </w:p>
-        </w:tc>
-        <w:tc>
-          <w:tcPr>
-            <w:tcW w:w="0" w:type="auto"/>
-            <w:vAlign w:val="center"/>
-            <w:hideMark/>
-          </w:tcPr>
-          <w:p>
-            <w:r>
-              <w:t>Code/design says: check PB Visibility Scope first; if absent, fall back to SP privacy bucket behavior</w:t>
+              <w:t>19</w:t>
+            </w:r>
+          </w:p>
+        </w:tc>
+        <w:tc>
+          <w:tcPr>
+            <w:tcW w:w="0" w:type="auto"/>
+            <w:vAlign w:val="center"/>
+            <w:hideMark/>
+          </w:tcPr>
+          <w:p>
+            <w:r>
+              <w:t>Preserve SP privacy buckets</w:t>
+            </w:r>
+          </w:p>
+        </w:tc>
+        <w:tc>
+          <w:tcPr>
+            <w:tcW w:w="0" w:type="auto"/>
+            <w:vAlign w:val="center"/>
+            <w:hideMark/>
+          </w:tcPr>
+          <w:p>
+            <w:r>
+              <w:t>Imported source-shaped privacy data</w:t>
+            </w:r>
+          </w:p>
+        </w:tc>
+        <w:tc>
+          <w:tcPr>
+            <w:tcW w:w="0" w:type="auto"/>
+            <w:vAlign w:val="center"/>
+            <w:hideMark/>
+          </w:tcPr>
+          <w:p>
+            <w:proofErr w:type="spellStart"/>
+            <w:r>
+              <w:t>pb_privacy_buckets</w:t>
+            </w:r>
+            <w:proofErr w:type="spellEnd"/>
+            <w:r>
+              <w:t xml:space="preserve"> remains untouched as SP import/export fidelity data</w:t>
             </w:r>
           </w:p>
         </w:tc>
@@ -1390,43 +1448,43 @@
           </w:tcPr>
           <w:p>
             <w:r>
-              <w:t>21</w:t>
-            </w:r>
-          </w:p>
-        </w:tc>
-        <w:tc>
-          <w:tcPr>
-            <w:tcW w:w="0" w:type="auto"/>
-            <w:vAlign w:val="center"/>
-            <w:hideMark/>
-          </w:tcPr>
-          <w:p>
-            <w:r>
-              <w:t>Keep PB Visibility Scope inactive until needed</w:t>
-            </w:r>
-          </w:p>
-        </w:tc>
-        <w:tc>
-          <w:tcPr>
-            <w:tcW w:w="0" w:type="auto"/>
-            <w:vAlign w:val="center"/>
-            <w:hideMark/>
-          </w:tcPr>
-          <w:p>
-            <w:r>
-              <w:t>Privacy boundary exists without forcing full enforcement</w:t>
-            </w:r>
-          </w:p>
-        </w:tc>
-        <w:tc>
-          <w:tcPr>
-            <w:tcW w:w="0" w:type="auto"/>
-            <w:vAlign w:val="center"/>
-            <w:hideMark/>
-          </w:tcPr>
-          <w:p>
-            <w:r>
-              <w:t>Owner path still works; no premature role-specific visibility behavior</w:t>
+              <w:t>20</w:t>
+            </w:r>
+          </w:p>
+        </w:tc>
+        <w:tc>
+          <w:tcPr>
+            <w:tcW w:w="0" w:type="auto"/>
+            <w:vAlign w:val="center"/>
+            <w:hideMark/>
+          </w:tcPr>
+          <w:p>
+            <w:r>
+              <w:t>Add visibility resolution rule</w:t>
+            </w:r>
+          </w:p>
+        </w:tc>
+        <w:tc>
+          <w:tcPr>
+            <w:tcW w:w="0" w:type="auto"/>
+            <w:vAlign w:val="center"/>
+            <w:hideMark/>
+          </w:tcPr>
+          <w:p>
+            <w:r>
+              <w:t>PB first, SP fallback</w:t>
+            </w:r>
+          </w:p>
+        </w:tc>
+        <w:tc>
+          <w:tcPr>
+            <w:tcW w:w="0" w:type="auto"/>
+            <w:vAlign w:val="center"/>
+            <w:hideMark/>
+          </w:tcPr>
+          <w:p>
+            <w:r>
+              <w:t>Code/design says: check PB Visibility Scope first; if absent, fall back to SP privacy bucket behavior</w:t>
             </w:r>
           </w:p>
         </w:tc>
@@ -1443,48 +1501,43 @@
           </w:tcPr>
           <w:p>
             <w:r>
-              <w:t>22</w:t>
-            </w:r>
-          </w:p>
-        </w:tc>
-        <w:tc>
-          <w:tcPr>
-            <w:tcW w:w="0" w:type="auto"/>
-            <w:vAlign w:val="center"/>
-            <w:hideMark/>
-          </w:tcPr>
-          <w:p>
-            <w:r>
-              <w:t>Define audit seam</w:t>
-            </w:r>
-          </w:p>
-        </w:tc>
-        <w:tc>
-          <w:tcPr>
-            <w:tcW w:w="0" w:type="auto"/>
-            <w:vAlign w:val="center"/>
-            <w:hideMark/>
-          </w:tcPr>
-          <w:p>
-            <w:r>
-              <w:t xml:space="preserve">Audit boundary as future evidence </w:t>
-            </w:r>
-            <w:proofErr w:type="gramStart"/>
-            <w:r>
-              <w:t>point</w:t>
-            </w:r>
-            <w:proofErr w:type="gramEnd"/>
-          </w:p>
-        </w:tc>
-        <w:tc>
-          <w:tcPr>
-            <w:tcW w:w="0" w:type="auto"/>
-            <w:vAlign w:val="center"/>
-            <w:hideMark/>
-          </w:tcPr>
-          <w:p>
-            <w:r>
-              <w:t>Boundary is named, but full audit implementation waits unless a concrete feature requires it</w:t>
+              <w:t>21</w:t>
+            </w:r>
+          </w:p>
+        </w:tc>
+        <w:tc>
+          <w:tcPr>
+            <w:tcW w:w="0" w:type="auto"/>
+            <w:vAlign w:val="center"/>
+            <w:hideMark/>
+          </w:tcPr>
+          <w:p>
+            <w:r>
+              <w:t>Keep PB Visibility Scope inactive until needed</w:t>
+            </w:r>
+          </w:p>
+        </w:tc>
+        <w:tc>
+          <w:tcPr>
+            <w:tcW w:w="0" w:type="auto"/>
+            <w:vAlign w:val="center"/>
+            <w:hideMark/>
+          </w:tcPr>
+          <w:p>
+            <w:r>
+              <w:t>Privacy boundary exists without forcing full enforcement</w:t>
+            </w:r>
+          </w:p>
+        </w:tc>
+        <w:tc>
+          <w:tcPr>
+            <w:tcW w:w="0" w:type="auto"/>
+            <w:vAlign w:val="center"/>
+            <w:hideMark/>
+          </w:tcPr>
+          <w:p>
+            <w:r>
+              <w:t>Owner path still works; no premature role-specific visibility behavior</w:t>
             </w:r>
           </w:p>
         </w:tc>
@@ -1497,59 +1550,47 @@
           <w:tcPr>
             <w:tcW w:w="0" w:type="auto"/>
             <w:vAlign w:val="center"/>
-          </w:tcPr>
-          <w:p>
-            <w:r>
-              <w:t>23</w:t>
-            </w:r>
-          </w:p>
-        </w:tc>
-        <w:tc>
-          <w:tcPr>
-            <w:tcW w:w="0" w:type="auto"/>
-            <w:vAlign w:val="center"/>
-          </w:tcPr>
-          <w:p>
-            <w:r>
-              <w:t>Add baseline diagnostic trace boundary</w:t>
-            </w:r>
-          </w:p>
-        </w:tc>
-        <w:tc>
-          <w:tcPr>
-            <w:tcW w:w="0" w:type="auto"/>
-            <w:vAlign w:val="center"/>
-          </w:tcPr>
-          <w:p>
-            <w:r>
-              <w:t>Always-on Level 1 trace context for the request spine.</w:t>
-            </w:r>
-          </w:p>
-        </w:tc>
-        <w:tc>
-          <w:tcPr>
-            <w:tcW w:w="0" w:type="auto"/>
-            <w:vAlign w:val="center"/>
-          </w:tcPr>
-          <w:p>
-            <w:r>
-              <w:t xml:space="preserve">Account resolution, membership resolution, system resolution, authorization, data access, and error handling emit minimal structured trace facts with </w:t>
-            </w:r>
-            <w:proofErr w:type="spellStart"/>
-            <w:r>
-              <w:t>TraceId</w:t>
-            </w:r>
-            <w:proofErr w:type="spellEnd"/>
-            <w:r>
-              <w:t>/</w:t>
-            </w:r>
-            <w:proofErr w:type="spellStart"/>
-            <w:r>
-              <w:t>CorrelationId</w:t>
-            </w:r>
-            <w:proofErr w:type="spellEnd"/>
-            <w:r>
-              <w:t xml:space="preserve"> and no sensitive content.</w:t>
+            <w:hideMark/>
+          </w:tcPr>
+          <w:p>
+            <w:r>
+              <w:t>22</w:t>
+            </w:r>
+          </w:p>
+        </w:tc>
+        <w:tc>
+          <w:tcPr>
+            <w:tcW w:w="0" w:type="auto"/>
+            <w:vAlign w:val="center"/>
+            <w:hideMark/>
+          </w:tcPr>
+          <w:p>
+            <w:r>
+              <w:t>Define audit seam</w:t>
+            </w:r>
+          </w:p>
+        </w:tc>
+        <w:tc>
+          <w:tcPr>
+            <w:tcW w:w="0" w:type="auto"/>
+            <w:vAlign w:val="center"/>
+            <w:hideMark/>
+          </w:tcPr>
+          <w:p>
+            <w:r>
+              <w:t>Audit boundary as future evidence point</w:t>
+            </w:r>
+          </w:p>
+        </w:tc>
+        <w:tc>
+          <w:tcPr>
+            <w:tcW w:w="0" w:type="auto"/>
+            <w:vAlign w:val="center"/>
+            <w:hideMark/>
+          </w:tcPr>
+          <w:p>
+            <w:r>
+              <w:t>Boundary is named, but full audit implementation waits unless a concrete feature requires it</w:t>
             </w:r>
           </w:p>
         </w:tc>
@@ -1565,64 +1606,54 @@
           </w:tcPr>
           <w:p>
             <w:r>
-              <w:t>24-Prereq</w:t>
-            </w:r>
-          </w:p>
-        </w:tc>
-        <w:tc>
-          <w:tcPr>
-            <w:tcW w:w="0" w:type="auto"/>
-            <w:vAlign w:val="center"/>
-          </w:tcPr>
-          <w:p>
-            <w:r>
-              <w:t>Add local rolling trace file sink</w:t>
-            </w:r>
-          </w:p>
-        </w:tc>
-        <w:tc>
-          <w:tcPr>
-            <w:tcW w:w="0" w:type="auto"/>
-            <w:vAlign w:val="center"/>
-          </w:tcPr>
-          <w:p>
-            <w:r>
-              <w:t xml:space="preserve">A durable local development log file for existing PB_LEVEL1_TRACE entries, using the current </w:t>
-            </w:r>
-            <w:proofErr w:type="spellStart"/>
-            <w:r>
-              <w:t>ILogger</w:t>
-            </w:r>
-            <w:proofErr w:type="spellEnd"/>
-            <w:r>
-              <w:t xml:space="preserve"> trace boundary without adding new trace facts or changing /</w:t>
-            </w:r>
-            <w:proofErr w:type="spellStart"/>
-            <w:r>
-              <w:t>api</w:t>
-            </w:r>
-            <w:proofErr w:type="spellEnd"/>
-            <w:r>
-              <w:t>/me behavior.</w:t>
-            </w:r>
-          </w:p>
-        </w:tc>
-        <w:tc>
-          <w:tcPr>
-            <w:tcW w:w="0" w:type="auto"/>
-            <w:vAlign w:val="center"/>
-          </w:tcPr>
-          <w:p>
-            <w:r>
-              <w:t>Running /</w:t>
-            </w:r>
-            <w:proofErr w:type="spellStart"/>
-            <w:r>
-              <w:t>api</w:t>
-            </w:r>
-            <w:proofErr w:type="spellEnd"/>
-            <w:r>
-              <w:t xml:space="preserve">/me writes the existing Level 1 trace entries to a local rolling log file, the file can be searched for PB_LEVEL1_TRACE, </w:t>
+              <w:t>23</w:t>
+            </w:r>
+          </w:p>
+        </w:tc>
+        <w:tc>
+          <w:tcPr>
+            <w:tcW w:w="0" w:type="auto"/>
+            <w:vAlign w:val="center"/>
+          </w:tcPr>
+          <w:p>
+            <w:r>
+              <w:t xml:space="preserve">Add baseline diagnostic </w:t>
+            </w:r>
+            <w:r>
+              <w:lastRenderedPageBreak/>
+              <w:t>trace boundary</w:t>
+            </w:r>
+          </w:p>
+        </w:tc>
+        <w:tc>
+          <w:tcPr>
+            <w:tcW w:w="0" w:type="auto"/>
+            <w:vAlign w:val="center"/>
+          </w:tcPr>
+          <w:p>
+            <w:r>
+              <w:lastRenderedPageBreak/>
+              <w:t xml:space="preserve">Always-on Level 1 trace context for the request </w:t>
+            </w:r>
+            <w:r>
+              <w:lastRenderedPageBreak/>
+              <w:t>spine.</w:t>
+            </w:r>
+          </w:p>
+        </w:tc>
+        <w:tc>
+          <w:tcPr>
+            <w:tcW w:w="0" w:type="auto"/>
+            <w:vAlign w:val="center"/>
+          </w:tcPr>
+          <w:p>
+            <w:r>
+              <w:lastRenderedPageBreak/>
+              <w:t xml:space="preserve">Account resolution, membership resolution, system resolution, authorization, data access, and error handling emit minimal structured trace facts </w:t>
+            </w:r>
+            <w:r>
+              <w:lastRenderedPageBreak/>
+              <w:t xml:space="preserve">with </w:t>
             </w:r>
             <w:proofErr w:type="spellStart"/>
             <w:r>
@@ -1630,7 +1661,7 @@
             </w:r>
             <w:proofErr w:type="spellEnd"/>
             <w:r>
-              <w:t xml:space="preserve">, </w:t>
+              <w:t>/</w:t>
             </w:r>
             <w:proofErr w:type="spellStart"/>
             <w:r>
@@ -1638,7 +1669,7 @@
             </w:r>
             <w:proofErr w:type="spellEnd"/>
             <w:r>
-              <w:t>, Stage, and Outcome, and the API still builds and returns the verified owner path.</w:t>
+              <w:t xml:space="preserve"> and no sensitive content.</w:t>
             </w:r>
           </w:p>
         </w:tc>
@@ -1655,6 +1686,95 @@
           <w:p>
             <w:r>
               <w:lastRenderedPageBreak/>
+              <w:t>24-Prereq</w:t>
+            </w:r>
+          </w:p>
+        </w:tc>
+        <w:tc>
+          <w:tcPr>
+            <w:tcW w:w="0" w:type="auto"/>
+            <w:vAlign w:val="center"/>
+          </w:tcPr>
+          <w:p>
+            <w:r>
+              <w:t>Add local rolling trace file sink</w:t>
+            </w:r>
+          </w:p>
+        </w:tc>
+        <w:tc>
+          <w:tcPr>
+            <w:tcW w:w="0" w:type="auto"/>
+            <w:vAlign w:val="center"/>
+          </w:tcPr>
+          <w:p>
+            <w:r>
+              <w:t xml:space="preserve">A durable local development log file for existing PB_LEVEL1_TRACE entries, using the current </w:t>
+            </w:r>
+            <w:proofErr w:type="spellStart"/>
+            <w:r>
+              <w:t>ILogger</w:t>
+            </w:r>
+            <w:proofErr w:type="spellEnd"/>
+            <w:r>
+              <w:t xml:space="preserve"> trace boundary without adding new trace facts or changing /</w:t>
+            </w:r>
+            <w:proofErr w:type="spellStart"/>
+            <w:r>
+              <w:t>api</w:t>
+            </w:r>
+            <w:proofErr w:type="spellEnd"/>
+            <w:r>
+              <w:t>/me behavior.</w:t>
+            </w:r>
+          </w:p>
+        </w:tc>
+        <w:tc>
+          <w:tcPr>
+            <w:tcW w:w="0" w:type="auto"/>
+            <w:vAlign w:val="center"/>
+          </w:tcPr>
+          <w:p>
+            <w:r>
+              <w:t>Running /</w:t>
+            </w:r>
+            <w:proofErr w:type="spellStart"/>
+            <w:r>
+              <w:t>api</w:t>
+            </w:r>
+            <w:proofErr w:type="spellEnd"/>
+            <w:r>
+              <w:t xml:space="preserve">/me writes the existing Level 1 trace entries to a local rolling log file, the file can be searched for PB_LEVEL1_TRACE, </w:t>
+            </w:r>
+            <w:proofErr w:type="spellStart"/>
+            <w:r>
+              <w:t>TraceId</w:t>
+            </w:r>
+            <w:proofErr w:type="spellEnd"/>
+            <w:r>
+              <w:t xml:space="preserve">, </w:t>
+            </w:r>
+            <w:proofErr w:type="spellStart"/>
+            <w:r>
+              <w:t>CorrelationId</w:t>
+            </w:r>
+            <w:proofErr w:type="spellEnd"/>
+            <w:r>
+              <w:t>, Stage, and Outcome, and the API still builds and returns the verified owner path.</w:t>
+            </w:r>
+          </w:p>
+        </w:tc>
+      </w:tr>
+      <w:tr>
+        <w:trPr>
+          <w:tblCellSpacing w:w="15" w:type="dxa"/>
+        </w:trPr>
+        <w:tc>
+          <w:tcPr>
+            <w:tcW w:w="0" w:type="auto"/>
+            <w:vAlign w:val="center"/>
+          </w:tcPr>
+          <w:p>
+            <w:r>
               <w:t>24</w:t>
             </w:r>
           </w:p>

</xml_diff>